<commit_message>
fix(sprzet): PDF protokołu trzyma szerokości kolumn i pokazuje podpis z NEXUSA
Zgłoszenie recepcji 28.10.2026: podpisu linkiem nie widać w PDF ani w Word,
a PDF się rozjeżdża.

- siatka tabeli pozycji niesie szerokości kolumn (LibreOffice czyta gridCol,
  nie tcW) i stały układ; „Lp.” szersze, IMEI mieści się w jednej linii,
- podpisy w tabelce bez ramek: strona, imię i nazwisko, linia, „(podpis)”,
- pod podpisem osoby dopisek „Potwierdzono elektronicznie linkiem z NEXUSA
  jako „…”, data, godz.” (tylko link), pod recepcją „Zatwierdzono w NEXUSIE:
  osoba, data, godz.” (tylko potwierdzony); nowe pola holder_signature /
  issuer_signature także dla wgranych wzorów,
- fonts-crosextra-caladea w obrazie (metryka Cambrii ze wzoru),
- strona /protocol/<token> ukrywa tabelkę podpisów jak wcześniej linie,
- TEMPLATE_VERSION 2026-10-28, wzory .docx przebudowane, reguła w docs.

Co-Authored-By: Claude Opus 5.5 <noreply@anthropic.com>
</commit_message>
<xml_diff>
--- a/backend/app/templates/equipment/protokol_wydania.docx
+++ b/backend/app/templates/equipment/protokol_wydania.docx
@@ -139,20 +139,22 @@
         <w:tblStyle w:val="TableGrid"/>
         <w:tblW w:type="auto" w:w="0"/>
         <w:jc w:val="center"/>
+        <w:tblLayout w:type="fixed"/>
         <w:tblLook w:firstColumn="1" w:firstRow="1" w:lastColumn="0" w:lastRow="0" w:noHBand="0" w:noVBand="1" w:val="04A0"/>
+        <w:tblLayout w:type="fixed"/>
       </w:tblPr>
       <w:tblGrid>
-        <w:gridCol w:w="1744"/>
-        <w:gridCol w:w="1744"/>
-        <w:gridCol w:w="1744"/>
-        <w:gridCol w:w="1744"/>
-        <w:gridCol w:w="1744"/>
-        <w:gridCol w:w="1744"/>
+        <w:gridCol w:w="567"/>
+        <w:gridCol w:w="2811"/>
+        <w:gridCol w:w="2643"/>
+        <w:gridCol w:w="992"/>
+        <w:gridCol w:w="1843"/>
+        <w:gridCol w:w="1275"/>
       </w:tblGrid>
       <w:tr>
         <w:tc>
           <w:tcPr>
-            <w:tcW w:type="dxa" w:w="418"/>
+            <w:tcW w:type="dxa" w:w="567"/>
           </w:tcPr>
           <w:p>
             <w:pPr>
@@ -170,7 +172,7 @@
         </w:tc>
         <w:tc>
           <w:tcPr>
-            <w:tcW w:type="dxa" w:w="2960"/>
+            <w:tcW w:type="dxa" w:w="2811"/>
           </w:tcPr>
           <w:p>
             <w:pPr>
@@ -262,7 +264,7 @@
       <w:tr>
         <w:tc>
           <w:tcPr>
-            <w:tcW w:type="dxa" w:w="418"/>
+            <w:tcW w:type="dxa" w:w="567"/>
           </w:tcPr>
           <w:p>
             <w:r>
@@ -277,7 +279,7 @@
         </w:tc>
         <w:tc>
           <w:tcPr>
-            <w:tcW w:type="dxa" w:w="2960"/>
+            <w:tcW w:type="dxa" w:w="2811"/>
           </w:tcPr>
           <w:p/>
         </w:tc>
@@ -309,7 +311,7 @@
       <w:tr>
         <w:tc>
           <w:tcPr>
-            <w:tcW w:type="dxa" w:w="418"/>
+            <w:tcW w:type="dxa" w:w="567"/>
           </w:tcPr>
           <w:p>
             <w:r>
@@ -324,7 +326,7 @@
         </w:tc>
         <w:tc>
           <w:tcPr>
-            <w:tcW w:type="dxa" w:w="2960"/>
+            <w:tcW w:type="dxa" w:w="2811"/>
           </w:tcPr>
           <w:p>
             <w:r>
@@ -413,7 +415,7 @@
       <w:tr>
         <w:tc>
           <w:tcPr>
-            <w:tcW w:type="dxa" w:w="418"/>
+            <w:tcW w:type="dxa" w:w="567"/>
           </w:tcPr>
           <w:p>
             <w:r>
@@ -428,7 +430,7 @@
         </w:tc>
         <w:tc>
           <w:tcPr>
-            <w:tcW w:type="dxa" w:w="2960"/>
+            <w:tcW w:type="dxa" w:w="2811"/>
           </w:tcPr>
           <w:p/>
         </w:tc>
@@ -460,13 +462,13 @@
       <w:tr>
         <w:tc>
           <w:tcPr>
-            <w:tcW w:type="dxa" w:w="418"/>
+            <w:tcW w:type="dxa" w:w="567"/>
           </w:tcPr>
           <w:p/>
         </w:tc>
         <w:tc>
           <w:tcPr>
-            <w:tcW w:type="dxa" w:w="2960"/>
+            <w:tcW w:type="dxa" w:w="2811"/>
           </w:tcPr>
           <w:p/>
         </w:tc>
@@ -863,67 +865,197 @@
     <w:p>
       <w:pPr>
         <w:spacing w:line="300" w:lineRule="exact"/>
-        <w:jc w:val="center"/>
       </w:pPr>
     </w:p>
-    <w:p>
-      <w:pPr>
-        <w:spacing w:line="300" w:lineRule="exact"/>
-      </w:pPr>
-      <w:r>
-        <w:rPr>
-          <w:rFonts w:ascii="Cambria" w:hAnsi="Cambria"/>
-          <w:b/>
-          <w:sz w:val="22"/>
-        </w:rPr>
-        <w:t xml:space="preserve">                  </w:t>
-      </w:r>
-      <w:r>
-        <w:rPr>
-          <w:rFonts w:ascii="Cambria" w:hAnsi="Cambria"/>
-          <w:b/>
-          <w:sz w:val="22"/>
-        </w:rPr>
-        <w:t>Strona przekazująca</w:t>
-      </w:r>
-      <w:r>
-        <w:rPr>
-          <w:rFonts w:ascii="Cambria" w:hAnsi="Cambria"/>
-          <w:b w:val="0"/>
-        </w:rPr>
-        <w:tab/>
-        <w:tab/>
-        <w:tab/>
-        <w:tab/>
-        <w:tab/>
-        <w:tab/>
-        <w:t xml:space="preserve">    </w:t>
-      </w:r>
-      <w:r>
-        <w:rPr>
-          <w:rFonts w:ascii="Cambria" w:hAnsi="Cambria"/>
-          <w:b/>
-          <w:sz w:val="22"/>
-        </w:rPr>
-        <w:t>Strona przyjmująca</w:t>
-      </w:r>
-    </w:p>
-    <w:p>
-      <w:pPr>
-        <w:spacing w:line="300" w:lineRule="exact"/>
+    <w:tbl>
+      <w:tblPr>
+        <w:tblW w:type="auto" w:w="0"/>
         <w:jc w:val="center"/>
-      </w:pPr>
-      <w:r>
-        <w:rPr>
-          <w:rFonts w:ascii="Cambria" w:hAnsi="Cambria"/>
-          <w:b w:val="0"/>
-          <w:sz w:val="22"/>
-        </w:rPr>
-        <w:t xml:space="preserve">(podpis)                                                </w:t>
-        <w:tab/>
-        <w:t xml:space="preserve">                                                    (podpis)</w:t>
-      </w:r>
-    </w:p>
+        <w:tblLayout w:type="fixed"/>
+        <w:tblLook w:firstColumn="1" w:firstRow="1" w:lastColumn="0" w:lastRow="0" w:noHBand="0" w:noVBand="1" w:val="04A0"/>
+        <w:tblLayout w:type="fixed"/>
+      </w:tblPr>
+      <w:tblGrid>
+        <w:gridCol w:w="5233"/>
+        <w:gridCol w:w="5233"/>
+      </w:tblGrid>
+      <w:tr>
+        <w:tc>
+          <w:tcPr>
+            <w:tcW w:type="dxa" w:w="5233"/>
+          </w:tcPr>
+          <w:p>
+            <w:pPr>
+              <w:jc w:val="center"/>
+            </w:pPr>
+            <w:r>
+              <w:rPr>
+                <w:rFonts w:ascii="Cambria" w:hAnsi="Cambria"/>
+                <w:b/>
+                <w:sz w:val="22"/>
+              </w:rPr>
+              <w:t>Strona przekazująca</w:t>
+            </w:r>
+          </w:p>
+        </w:tc>
+        <w:tc>
+          <w:tcPr>
+            <w:tcW w:type="dxa" w:w="5233"/>
+          </w:tcPr>
+          <w:p>
+            <w:pPr>
+              <w:jc w:val="center"/>
+            </w:pPr>
+            <w:r>
+              <w:rPr>
+                <w:rFonts w:ascii="Cambria" w:hAnsi="Cambria"/>
+                <w:b/>
+                <w:sz w:val="22"/>
+              </w:rPr>
+              <w:t>Strona przyjmująca</w:t>
+            </w:r>
+          </w:p>
+        </w:tc>
+      </w:tr>
+      <w:tr>
+        <w:tc>
+          <w:tcPr>
+            <w:tcW w:type="dxa" w:w="5233"/>
+          </w:tcPr>
+          <w:p>
+            <w:pPr>
+              <w:jc w:val="center"/>
+            </w:pPr>
+            <w:r>
+              <w:rPr>
+                <w:rFonts w:ascii="Calibri" w:hAnsi="Calibri"/>
+                <w:b w:val="0"/>
+                <w:sz w:val="20"/>
+              </w:rPr>
+              <w:t>{{ issuer_name }}</w:t>
+            </w:r>
+          </w:p>
+        </w:tc>
+        <w:tc>
+          <w:tcPr>
+            <w:tcW w:type="dxa" w:w="5233"/>
+          </w:tcPr>
+          <w:p>
+            <w:pPr>
+              <w:jc w:val="center"/>
+            </w:pPr>
+            <w:r>
+              <w:rPr>
+                <w:rFonts w:ascii="Calibri" w:hAnsi="Calibri"/>
+                <w:b w:val="0"/>
+                <w:sz w:val="20"/>
+              </w:rPr>
+              <w:t>{{ holder_name }}</w:t>
+            </w:r>
+          </w:p>
+        </w:tc>
+      </w:tr>
+      <w:tr>
+        <w:tc>
+          <w:tcPr>
+            <w:tcW w:type="dxa" w:w="5233"/>
+          </w:tcPr>
+          <w:p>
+            <w:pPr>
+              <w:jc w:val="center"/>
+            </w:pPr>
+            <w:r>
+              <w:rPr>
+                <w:rFonts w:ascii="Cambria" w:hAnsi="Cambria"/>
+                <w:b w:val="0"/>
+                <w:sz w:val="18"/>
+              </w:rPr>
+              <w:t>............................................................</w:t>
+            </w:r>
+          </w:p>
+        </w:tc>
+        <w:tc>
+          <w:tcPr>
+            <w:tcW w:type="dxa" w:w="5233"/>
+          </w:tcPr>
+          <w:p>
+            <w:pPr>
+              <w:jc w:val="center"/>
+            </w:pPr>
+            <w:r>
+              <w:rPr>
+                <w:rFonts w:ascii="Cambria" w:hAnsi="Cambria"/>
+                <w:b w:val="0"/>
+                <w:sz w:val="18"/>
+              </w:rPr>
+              <w:t>............................................................</w:t>
+            </w:r>
+          </w:p>
+        </w:tc>
+      </w:tr>
+      <w:tr>
+        <w:tc>
+          <w:tcPr>
+            <w:tcW w:type="dxa" w:w="5233"/>
+          </w:tcPr>
+          <w:p>
+            <w:pPr>
+              <w:jc w:val="center"/>
+            </w:pPr>
+            <w:r>
+              <w:rPr>
+                <w:rFonts w:ascii="Cambria" w:hAnsi="Cambria"/>
+                <w:b w:val="0"/>
+                <w:sz w:val="18"/>
+              </w:rPr>
+              <w:t>(podpis)</w:t>
+            </w:r>
+          </w:p>
+          <w:p>
+            <w:pPr>
+              <w:jc w:val="center"/>
+            </w:pPr>
+            <w:r>
+              <w:rPr>
+                <w:rFonts w:ascii="Calibri" w:hAnsi="Calibri"/>
+                <w:sz w:val="16"/>
+              </w:rPr>
+              <w:t>{{ issuer_signature }}</w:t>
+            </w:r>
+          </w:p>
+        </w:tc>
+        <w:tc>
+          <w:tcPr>
+            <w:tcW w:type="dxa" w:w="5233"/>
+          </w:tcPr>
+          <w:p>
+            <w:pPr>
+              <w:jc w:val="center"/>
+            </w:pPr>
+            <w:r>
+              <w:rPr>
+                <w:rFonts w:ascii="Cambria" w:hAnsi="Cambria"/>
+                <w:b w:val="0"/>
+                <w:sz w:val="18"/>
+              </w:rPr>
+              <w:t>(podpis)</w:t>
+            </w:r>
+          </w:p>
+          <w:p>
+            <w:pPr>
+              <w:jc w:val="center"/>
+            </w:pPr>
+            <w:r>
+              <w:rPr>
+                <w:rFonts w:ascii="Calibri" w:hAnsi="Calibri"/>
+                <w:sz w:val="16"/>
+              </w:rPr>
+              <w:t>{{ holder_signature }}</w:t>
+            </w:r>
+          </w:p>
+        </w:tc>
+      </w:tr>
+    </w:tbl>
     <w:sectPr>
       <w:pgSz w:w="11906" w:h="16838"/>
       <w:pgMar w:top="720" w:right="720" w:bottom="720" w:left="720" w:header="720" w:footer="720" w:gutter="0"/>

</xml_diff>